<commit_message>
harassment: specify written (electronic) consent for PeerJ submission
PeerJ requires the manuscript to explicitly note the form of consent
(verbal or written). The previous wording "All participants provided
informed consent" did not specify written vs verbal. The Lancers
crowdsourcing survey was administered via Google Forms with a consent
page presented prior to the questionnaire — i.e., participants
provided written informed consent electronically.

Updated paragraphs (Methods Ethical Considerations and the parallel
Informed Consent declaration in the Title page) now state:

  All participants provided written informed consent electronically
  through the Google Forms consent page presented prior to the
  questionnaire, before responding to any survey items.

Applied to: Manuscript_PeerJ.docx, Manuscript_only.docx,
Manuscript_all.docx, Title page with Declarations.docx.

https://claude.ai/code/session_01UeeDffUu7YPckkYAGec83X
</commit_message>
<xml_diff>
--- a/harassment/paper-revisions/Manuscript_PeerJ.docx
+++ b/harassment/paper-revisions/Manuscript_PeerJ.docx
@@ -1,6 +1,6 @@
 
 <file path=word/document.xml><?xml version="1.0" encoding="utf-8"?>
-<w:document xmlns:wpc="http://schemas.microsoft.com/office/word/2010/wordprocessingCanvas" xmlns:mo="http://schemas.microsoft.com/office/mac/office/2008/main" xmlns:mc="http://schemas.openxmlformats.org/markup-compatibility/2006" xmlns:mv="urn:schemas-microsoft-com:mac:vml" xmlns:o="urn:schemas-microsoft-com:office:office" xmlns:r="http://schemas.openxmlformats.org/officeDocument/2006/relationships" xmlns:m="http://schemas.openxmlformats.org/officeDocument/2006/math" xmlns:v="urn:schemas-microsoft-com:vml" xmlns:wp14="http://schemas.microsoft.com/office/word/2010/wordprocessingDrawing" xmlns:wp="http://schemas.openxmlformats.org/drawingml/2006/wordprocessingDrawing" xmlns:w10="urn:schemas-microsoft-com:office:word" xmlns:w="http://schemas.openxmlformats.org/wordprocessingml/2006/main" xmlns:w14="http://schemas.microsoft.com/office/word/2010/wordml" xmlns:wpg="http://schemas.microsoft.com/office/word/2010/wordprocessingGroup" xmlns:wpi="http://schemas.microsoft.com/office/word/2010/wordprocessingInk" xmlns:wne="http://schemas.microsoft.com/office/word/2006/wordml" xmlns:wps="http://schemas.microsoft.com/office/word/2010/wordprocessingShape" mc:Ignorable="w14 wp14">
+<w:document xmlns:mc="http://schemas.openxmlformats.org/markup-compatibility/2006" xmlns:w="http://schemas.openxmlformats.org/wordprocessingml/2006/main" mc:Ignorable="w14 wp14">
   <w:body>
     <w:p>
       <w:pPr>
@@ -433,7 +433,7 @@
         <w:rPr>
           <w:i w:val="0"/>
         </w:rPr>
-        <w:t>Prior to questionnaire administration, participants were provided with written information about the purpose of the study, the procedures, the voluntary nature of participation and their right to withdraw at any time without penalty, the privacy-protection procedures (including the separate storage and subsequent permanent deletion of crowdsourcing-platform user identifiers, the retention of only de-identified questionnaire data, and the public archiving of the de-identified dataset), and the planned dissemination of results. All participants provided informed consent before responding to the questionnaire. Crowdsourcing-platform user identifiers were temporarily linked to questionnaire responses solely for the purpose of disbursing participant compensation and were permanently deleted after payment, after which the dataset retained for analysis and public release contained no direct or indirect identifiers (the dataset was de-identified, not anonymously collected). The study protocol was reviewed and approved by the Institutional Review Board of the Public Health Research Foundation (Reference No. 25G0001), an independent ethics review body unaffiliated with the author and SUNBLAZE Co., Ltd.</w:t>
+        <w:t xml:space="preserve">Prior to questionnaire administration, participants were provided with written information about the purpose of the study, the procedures, the voluntary nature of participation and their right to withdraw at any time without penalty, the privacy-protection procedures (including the separate storage and subsequent permanent deletion of crowdsourcing-platform user identifiers, the retention of only de-identified questionnaire data, and the public archiving of the de-identified dataset), and the planned dissemination of results. All participants provided written informed consent electronically through the Google Forms consent page presented prior to the questionnaire, before responding to any survey items. Crowdsourcing-platform user identifiers were temporarily linked to questionnaire responses solely for the purpose of disbursing participant compensation and were permanently deleted after payment, after which the dataset retained for analysis and public release contained no direct or indirect identifiers (the dataset was de-identified, not anonymously collected). The study protocol was reviewed and approved by the Institutional Review Board of the Public Health Research Foundation (Reference No. 25G0001), an independent ethics review body unaffiliated with the author and SUNBLAZE Co., Ltd.</w:t>
       </w:r>
     </w:p>
     <w:p>

</xml_diff>